<commit_message>
Można pobrać załączniki 9,1,2,2a,3,6,4 po ich ukończeniu
</commit_message>
<xml_diff>
--- a/Projekt/app/docs/Zal_3.docx
+++ b/Projekt/app/docs/Zal_3.docx
@@ -174,7 +174,39 @@
                 <w:rFonts w:asciiTheme="majorHAnsi" w:hAnsiTheme="majorHAnsi"/>
                 <w:sz w:val="22"/>
               </w:rPr>
-              <w:t>{{ student_practice.get(selected_student.id, {}).get('nr_porozumienia'</w:t>
+              <w:t xml:space="preserve">{{ </w:t>
+            </w:r>
+            <w:proofErr w:type="spellStart"/>
+            <w:r>
+              <w:rPr>
+                <w:rFonts w:asciiTheme="majorHAnsi" w:hAnsiTheme="majorHAnsi"/>
+                <w:sz w:val="22"/>
+              </w:rPr>
+              <w:t>student_practice.get</w:t>
+            </w:r>
+            <w:proofErr w:type="spellEnd"/>
+            <w:r>
+              <w:rPr>
+                <w:rFonts w:asciiTheme="majorHAnsi" w:hAnsiTheme="majorHAnsi"/>
+                <w:sz w:val="22"/>
+              </w:rPr>
+              <w:t>(selected_student.id, {}).get('</w:t>
+            </w:r>
+            <w:proofErr w:type="spellStart"/>
+            <w:r>
+              <w:rPr>
+                <w:rFonts w:asciiTheme="majorHAnsi" w:hAnsiTheme="majorHAnsi"/>
+                <w:sz w:val="22"/>
+              </w:rPr>
+              <w:t>nr_porozumienia</w:t>
+            </w:r>
+            <w:proofErr w:type="spellEnd"/>
+            <w:r>
+              <w:rPr>
+                <w:rFonts w:asciiTheme="majorHAnsi" w:hAnsiTheme="majorHAnsi"/>
+                <w:sz w:val="22"/>
+              </w:rPr>
+              <w:t>'</w:t>
             </w:r>
             <w:r>
               <w:rPr>
@@ -206,7 +238,39 @@
                 <w:rFonts w:asciiTheme="majorHAnsi" w:hAnsiTheme="majorHAnsi"/>
                 <w:sz w:val="22"/>
               </w:rPr>
-              <w:t>{{ student_practice.get(selected_student.id, {}).get('data_zawarcia'</w:t>
+              <w:t xml:space="preserve">{{ </w:t>
+            </w:r>
+            <w:proofErr w:type="spellStart"/>
+            <w:r>
+              <w:rPr>
+                <w:rFonts w:asciiTheme="majorHAnsi" w:hAnsiTheme="majorHAnsi"/>
+                <w:sz w:val="22"/>
+              </w:rPr>
+              <w:t>student_practice.get</w:t>
+            </w:r>
+            <w:proofErr w:type="spellEnd"/>
+            <w:r>
+              <w:rPr>
+                <w:rFonts w:asciiTheme="majorHAnsi" w:hAnsiTheme="majorHAnsi"/>
+                <w:sz w:val="22"/>
+              </w:rPr>
+              <w:t>(selected_student.id, {}).get('</w:t>
+            </w:r>
+            <w:proofErr w:type="spellStart"/>
+            <w:r>
+              <w:rPr>
+                <w:rFonts w:asciiTheme="majorHAnsi" w:hAnsiTheme="majorHAnsi"/>
+                <w:sz w:val="22"/>
+              </w:rPr>
+              <w:t>data_zawarcia</w:t>
+            </w:r>
+            <w:proofErr w:type="spellEnd"/>
+            <w:r>
+              <w:rPr>
+                <w:rFonts w:asciiTheme="majorHAnsi" w:hAnsiTheme="majorHAnsi"/>
+                <w:sz w:val="22"/>
+              </w:rPr>
+              <w:t>'</w:t>
             </w:r>
             <w:r>
               <w:rPr>
@@ -239,7 +303,39 @@
                 <w:rFonts w:asciiTheme="majorHAnsi" w:hAnsiTheme="majorHAnsi" w:cstheme="minorHAnsi"/>
                 <w:sz w:val="22"/>
               </w:rPr>
-              <w:t>{{ student_practice.get(selected_student.id, {}).get('nazwa_zakladu_pracy'</w:t>
+              <w:t xml:space="preserve">{{ </w:t>
+            </w:r>
+            <w:proofErr w:type="spellStart"/>
+            <w:r>
+              <w:rPr>
+                <w:rFonts w:asciiTheme="majorHAnsi" w:hAnsiTheme="majorHAnsi" w:cstheme="minorHAnsi"/>
+                <w:sz w:val="22"/>
+              </w:rPr>
+              <w:t>student_practice.get</w:t>
+            </w:r>
+            <w:proofErr w:type="spellEnd"/>
+            <w:r>
+              <w:rPr>
+                <w:rFonts w:asciiTheme="majorHAnsi" w:hAnsiTheme="majorHAnsi" w:cstheme="minorHAnsi"/>
+                <w:sz w:val="22"/>
+              </w:rPr>
+              <w:t>(selected_student.id, {}).get('</w:t>
+            </w:r>
+            <w:proofErr w:type="spellStart"/>
+            <w:r>
+              <w:rPr>
+                <w:rFonts w:asciiTheme="majorHAnsi" w:hAnsiTheme="majorHAnsi" w:cstheme="minorHAnsi"/>
+                <w:sz w:val="22"/>
+              </w:rPr>
+              <w:t>nazwa_zakladu_pracy</w:t>
+            </w:r>
+            <w:proofErr w:type="spellEnd"/>
+            <w:r>
+              <w:rPr>
+                <w:rFonts w:asciiTheme="majorHAnsi" w:hAnsiTheme="majorHAnsi" w:cstheme="minorHAnsi"/>
+                <w:sz w:val="22"/>
+              </w:rPr>
+              <w:t>'</w:t>
             </w:r>
             <w:r>
               <w:rPr>
@@ -314,7 +410,39 @@
                 <w:rFonts w:asciiTheme="majorHAnsi" w:hAnsiTheme="majorHAnsi"/>
                 <w:sz w:val="22"/>
               </w:rPr>
-              <w:t>{{ student.imie }} {{ student.nazwisko }}</w:t>
+              <w:t xml:space="preserve">{{ </w:t>
+            </w:r>
+            <w:proofErr w:type="spellStart"/>
+            <w:r>
+              <w:rPr>
+                <w:rFonts w:asciiTheme="majorHAnsi" w:hAnsiTheme="majorHAnsi"/>
+                <w:sz w:val="22"/>
+              </w:rPr>
+              <w:t>student.imie</w:t>
+            </w:r>
+            <w:proofErr w:type="spellEnd"/>
+            <w:r>
+              <w:rPr>
+                <w:rFonts w:asciiTheme="majorHAnsi" w:hAnsiTheme="majorHAnsi"/>
+                <w:sz w:val="22"/>
+              </w:rPr>
+              <w:t xml:space="preserve"> }} {{ </w:t>
+            </w:r>
+            <w:proofErr w:type="spellStart"/>
+            <w:r>
+              <w:rPr>
+                <w:rFonts w:asciiTheme="majorHAnsi" w:hAnsiTheme="majorHAnsi"/>
+                <w:sz w:val="22"/>
+              </w:rPr>
+              <w:t>student.nazwisko</w:t>
+            </w:r>
+            <w:proofErr w:type="spellEnd"/>
+            <w:r>
+              <w:rPr>
+                <w:rFonts w:asciiTheme="majorHAnsi" w:hAnsiTheme="majorHAnsi"/>
+                <w:sz w:val="22"/>
+              </w:rPr>
+              <w:t xml:space="preserve"> }}</w:t>
             </w:r>
           </w:p>
           <w:p>
@@ -345,7 +473,23 @@
                 <w:rFonts w:asciiTheme="majorHAnsi" w:hAnsiTheme="majorHAnsi"/>
                 <w:sz w:val="22"/>
               </w:rPr>
-              <w:t>{{ student.numer_albumu }}</w:t>
+              <w:t xml:space="preserve">{{ </w:t>
+            </w:r>
+            <w:proofErr w:type="spellStart"/>
+            <w:r>
+              <w:rPr>
+                <w:rFonts w:asciiTheme="majorHAnsi" w:hAnsiTheme="majorHAnsi"/>
+                <w:sz w:val="22"/>
+              </w:rPr>
+              <w:t>student.numer_albumu</w:t>
+            </w:r>
+            <w:proofErr w:type="spellEnd"/>
+            <w:r>
+              <w:rPr>
+                <w:rFonts w:asciiTheme="majorHAnsi" w:hAnsiTheme="majorHAnsi"/>
+                <w:sz w:val="22"/>
+              </w:rPr>
+              <w:t xml:space="preserve"> }}</w:t>
             </w:r>
           </w:p>
           <w:p>
@@ -389,8 +533,19 @@
                 <w:bCs/>
                 <w:sz w:val="22"/>
               </w:rPr>
-              <w:t>{{ selected_student.forma_studiow</w:t>
-            </w:r>
+              <w:t xml:space="preserve">{{ </w:t>
+            </w:r>
+            <w:proofErr w:type="spellStart"/>
+            <w:r>
+              <w:rPr>
+                <w:rFonts w:asciiTheme="majorHAnsi" w:hAnsiTheme="majorHAnsi"/>
+                <w:b/>
+                <w:bCs/>
+                <w:sz w:val="22"/>
+              </w:rPr>
+              <w:t>selected_student.forma_studiow</w:t>
+            </w:r>
+            <w:proofErr w:type="spellEnd"/>
             <w:r>
               <w:rPr>
                 <w:rFonts w:asciiTheme="majorHAnsi" w:hAnsiTheme="majorHAnsi"/>
@@ -468,8 +623,17 @@
                 <w:rFonts w:asciiTheme="majorHAnsi" w:hAnsiTheme="majorHAnsi"/>
                 <w:sz w:val="22"/>
               </w:rPr>
-              <w:t>{{ selected_student.specjalnosc</w:t>
-            </w:r>
+              <w:t xml:space="preserve">{{ </w:t>
+            </w:r>
+            <w:proofErr w:type="spellStart"/>
+            <w:r>
+              <w:rPr>
+                <w:rFonts w:asciiTheme="majorHAnsi" w:hAnsiTheme="majorHAnsi"/>
+                <w:sz w:val="22"/>
+              </w:rPr>
+              <w:t>selected_student.specjalnosc</w:t>
+            </w:r>
+            <w:proofErr w:type="spellEnd"/>
             <w:r>
               <w:rPr>
                 <w:rFonts w:asciiTheme="majorHAnsi" w:hAnsiTheme="majorHAnsi"/>
@@ -580,7 +744,55 @@
                 <w:rFonts w:asciiTheme="majorHAnsi" w:hAnsiTheme="majorHAnsi"/>
                 <w:sz w:val="22"/>
               </w:rPr>
-              <w:t>{{ student_practice.get(selected_student.id, {}).get('uczelniany_opiekun'</w:t>
+              <w:t xml:space="preserve">{{ </w:t>
+            </w:r>
+            <w:proofErr w:type="spellStart"/>
+            <w:r>
+              <w:rPr>
+                <w:rFonts w:asciiTheme="majorHAnsi" w:hAnsiTheme="majorHAnsi"/>
+                <w:sz w:val="22"/>
+              </w:rPr>
+              <w:t>student_practice.get</w:t>
+            </w:r>
+            <w:proofErr w:type="spellEnd"/>
+            <w:r>
+              <w:rPr>
+                <w:rFonts w:asciiTheme="majorHAnsi" w:hAnsiTheme="majorHAnsi"/>
+                <w:sz w:val="22"/>
+              </w:rPr>
+              <w:t>(selected_student.id, {}).</w:t>
+            </w:r>
+            <w:proofErr w:type="spellStart"/>
+            <w:r>
+              <w:rPr>
+                <w:rFonts w:asciiTheme="majorHAnsi" w:hAnsiTheme="majorHAnsi"/>
+                <w:sz w:val="22"/>
+              </w:rPr>
+              <w:t>get</w:t>
+            </w:r>
+            <w:proofErr w:type="spellEnd"/>
+            <w:r>
+              <w:rPr>
+                <w:rFonts w:asciiTheme="majorHAnsi" w:hAnsiTheme="majorHAnsi"/>
+                <w:sz w:val="22"/>
+              </w:rPr>
+              <w:t>('</w:t>
+            </w:r>
+            <w:proofErr w:type="spellStart"/>
+            <w:r>
+              <w:rPr>
+                <w:rFonts w:asciiTheme="majorHAnsi" w:hAnsiTheme="majorHAnsi"/>
+                <w:sz w:val="22"/>
+              </w:rPr>
+              <w:t>uczelniany_opiekun</w:t>
+            </w:r>
+            <w:proofErr w:type="spellEnd"/>
+            <w:r>
+              <w:rPr>
+                <w:rFonts w:asciiTheme="majorHAnsi" w:hAnsiTheme="majorHAnsi"/>
+                <w:sz w:val="22"/>
+              </w:rPr>
+              <w:t>'</w:t>
             </w:r>
             <w:r>
               <w:rPr>
@@ -648,8 +860,9 @@
                 <w:color w:val="000000"/>
                 <w:sz w:val="22"/>
               </w:rPr>
-              <w:t>{{ student_practice.get(selected_student.id, {}).get('termin_od'</w:t>
-            </w:r>
+              <w:t xml:space="preserve">{{ </w:t>
+            </w:r>
+            <w:proofErr w:type="spellStart"/>
             <w:r>
               <w:rPr>
                 <w:rFonts w:asciiTheme="majorHAnsi" w:hAnsiTheme="majorHAnsi"/>
@@ -657,8 +870,9 @@
                 <w:color w:val="000000"/>
                 <w:sz w:val="22"/>
               </w:rPr>
-              <w:t>)</w:t>
-            </w:r>
+              <w:t>student_practice.get</w:t>
+            </w:r>
+            <w:proofErr w:type="spellEnd"/>
             <w:r>
               <w:rPr>
                 <w:rFonts w:asciiTheme="majorHAnsi" w:hAnsiTheme="majorHAnsi"/>
@@ -666,6 +880,64 @@
                 <w:color w:val="000000"/>
                 <w:sz w:val="22"/>
               </w:rPr>
+              <w:t>(selected_student.id, {}).</w:t>
+            </w:r>
+            <w:proofErr w:type="spellStart"/>
+            <w:r>
+              <w:rPr>
+                <w:rFonts w:asciiTheme="majorHAnsi" w:hAnsiTheme="majorHAnsi"/>
+                <w:bCs/>
+                <w:color w:val="000000"/>
+                <w:sz w:val="22"/>
+              </w:rPr>
+              <w:t>get</w:t>
+            </w:r>
+            <w:proofErr w:type="spellEnd"/>
+            <w:r>
+              <w:rPr>
+                <w:rFonts w:asciiTheme="majorHAnsi" w:hAnsiTheme="majorHAnsi"/>
+                <w:bCs/>
+                <w:color w:val="000000"/>
+                <w:sz w:val="22"/>
+              </w:rPr>
+              <w:t>('</w:t>
+            </w:r>
+            <w:proofErr w:type="spellStart"/>
+            <w:r>
+              <w:rPr>
+                <w:rFonts w:asciiTheme="majorHAnsi" w:hAnsiTheme="majorHAnsi"/>
+                <w:bCs/>
+                <w:color w:val="000000"/>
+                <w:sz w:val="22"/>
+              </w:rPr>
+              <w:t>termin_od</w:t>
+            </w:r>
+            <w:proofErr w:type="spellEnd"/>
+            <w:r>
+              <w:rPr>
+                <w:rFonts w:asciiTheme="majorHAnsi" w:hAnsiTheme="majorHAnsi"/>
+                <w:bCs/>
+                <w:color w:val="000000"/>
+                <w:sz w:val="22"/>
+              </w:rPr>
+              <w:t>'</w:t>
+            </w:r>
+            <w:r>
+              <w:rPr>
+                <w:rFonts w:asciiTheme="majorHAnsi" w:hAnsiTheme="majorHAnsi"/>
+                <w:bCs/>
+                <w:color w:val="000000"/>
+                <w:sz w:val="22"/>
+              </w:rPr>
+              <w:t>)</w:t>
+            </w:r>
+            <w:r>
+              <w:rPr>
+                <w:rFonts w:asciiTheme="majorHAnsi" w:hAnsiTheme="majorHAnsi"/>
+                <w:bCs/>
+                <w:color w:val="000000"/>
+                <w:sz w:val="22"/>
+              </w:rPr>
               <w:t xml:space="preserve"> }}</w:t>
             </w:r>
             <w:r>
@@ -692,7 +964,67 @@
                 <w:color w:val="000000"/>
                 <w:sz w:val="22"/>
               </w:rPr>
-              <w:t>{{ student_practice.get(selected_student.id, {}).get('termin_do') }}</w:t>
+              <w:t xml:space="preserve">{{ </w:t>
+            </w:r>
+            <w:proofErr w:type="spellStart"/>
+            <w:r>
+              <w:rPr>
+                <w:rFonts w:asciiTheme="majorHAnsi" w:hAnsiTheme="majorHAnsi"/>
+                <w:bCs/>
+                <w:color w:val="000000"/>
+                <w:sz w:val="22"/>
+              </w:rPr>
+              <w:t>student_practice.get</w:t>
+            </w:r>
+            <w:proofErr w:type="spellEnd"/>
+            <w:r>
+              <w:rPr>
+                <w:rFonts w:asciiTheme="majorHAnsi" w:hAnsiTheme="majorHAnsi"/>
+                <w:bCs/>
+                <w:color w:val="000000"/>
+                <w:sz w:val="22"/>
+              </w:rPr>
+              <w:t>(selected_student.id, {}).</w:t>
+            </w:r>
+            <w:proofErr w:type="spellStart"/>
+            <w:r>
+              <w:rPr>
+                <w:rFonts w:asciiTheme="majorHAnsi" w:hAnsiTheme="majorHAnsi"/>
+                <w:bCs/>
+                <w:color w:val="000000"/>
+                <w:sz w:val="22"/>
+              </w:rPr>
+              <w:t>get</w:t>
+            </w:r>
+            <w:proofErr w:type="spellEnd"/>
+            <w:r>
+              <w:rPr>
+                <w:rFonts w:asciiTheme="majorHAnsi" w:hAnsiTheme="majorHAnsi"/>
+                <w:bCs/>
+                <w:color w:val="000000"/>
+                <w:sz w:val="22"/>
+              </w:rPr>
+              <w:t>('</w:t>
+            </w:r>
+            <w:proofErr w:type="spellStart"/>
+            <w:r>
+              <w:rPr>
+                <w:rFonts w:asciiTheme="majorHAnsi" w:hAnsiTheme="majorHAnsi"/>
+                <w:bCs/>
+                <w:color w:val="000000"/>
+                <w:sz w:val="22"/>
+              </w:rPr>
+              <w:t>termin_do</w:t>
+            </w:r>
+            <w:proofErr w:type="spellEnd"/>
+            <w:r>
+              <w:rPr>
+                <w:rFonts w:asciiTheme="majorHAnsi" w:hAnsiTheme="majorHAnsi"/>
+                <w:bCs/>
+                <w:color w:val="000000"/>
+                <w:sz w:val="22"/>
+              </w:rPr>
+              <w:t>') }}</w:t>
             </w:r>
           </w:p>
         </w:tc>
@@ -782,7 +1114,25 @@
                 <w:sz w:val="22"/>
                 <w:szCs w:val="24"/>
               </w:rPr>
-              <w:t>{{ director_full_name }}</w:t>
+              <w:t xml:space="preserve">{{ </w:t>
+            </w:r>
+            <w:proofErr w:type="spellStart"/>
+            <w:r>
+              <w:rPr>
+                <w:rFonts w:asciiTheme="majorHAnsi" w:hAnsiTheme="majorHAnsi" w:cs="Arial"/>
+                <w:sz w:val="22"/>
+                <w:szCs w:val="24"/>
+              </w:rPr>
+              <w:t>director_full_name</w:t>
+            </w:r>
+            <w:proofErr w:type="spellEnd"/>
+            <w:r>
+              <w:rPr>
+                <w:rFonts w:asciiTheme="majorHAnsi" w:hAnsiTheme="majorHAnsi" w:cs="Arial"/>
+                <w:sz w:val="22"/>
+                <w:szCs w:val="24"/>
+              </w:rPr>
+              <w:t xml:space="preserve"> }}</w:t>
             </w:r>
           </w:p>
           <w:p>
@@ -889,7 +1239,39 @@
                 <w:rFonts w:asciiTheme="majorHAnsi" w:hAnsiTheme="majorHAnsi" w:cs="Arial"/>
                 <w:sz w:val="22"/>
               </w:rPr>
-              <w:t>{{ student_practice.get(selected_student.id, {}).get('firmowy_opiekun'</w:t>
+              <w:t xml:space="preserve">{{ </w:t>
+            </w:r>
+            <w:proofErr w:type="spellStart"/>
+            <w:r>
+              <w:rPr>
+                <w:rFonts w:asciiTheme="majorHAnsi" w:hAnsiTheme="majorHAnsi" w:cs="Arial"/>
+                <w:sz w:val="22"/>
+              </w:rPr>
+              <w:t>student_practice.get</w:t>
+            </w:r>
+            <w:proofErr w:type="spellEnd"/>
+            <w:r>
+              <w:rPr>
+                <w:rFonts w:asciiTheme="majorHAnsi" w:hAnsiTheme="majorHAnsi" w:cs="Arial"/>
+                <w:sz w:val="22"/>
+              </w:rPr>
+              <w:t>(selected_student.id, {}).get('</w:t>
+            </w:r>
+            <w:proofErr w:type="spellStart"/>
+            <w:r>
+              <w:rPr>
+                <w:rFonts w:asciiTheme="majorHAnsi" w:hAnsiTheme="majorHAnsi" w:cs="Arial"/>
+                <w:sz w:val="22"/>
+              </w:rPr>
+              <w:t>firmowy_opiekun</w:t>
+            </w:r>
+            <w:proofErr w:type="spellEnd"/>
+            <w:r>
+              <w:rPr>
+                <w:rFonts w:asciiTheme="majorHAnsi" w:hAnsiTheme="majorHAnsi" w:cs="Arial"/>
+                <w:sz w:val="22"/>
+              </w:rPr>
+              <w:t>'</w:t>
             </w:r>
             <w:r>
               <w:rPr>
@@ -904,7 +1286,61 @@
                 <w:sz w:val="22"/>
                 <w:lang w:val="pl-PL"/>
               </w:rPr>
-              <w:t>{{ student_practice.get(selected_student.id, {}).get('firmowy_stanowisko'</w:t>
+              <w:t xml:space="preserve">{{ </w:t>
+            </w:r>
+            <w:proofErr w:type="spellStart"/>
+            <w:r>
+              <w:rPr>
+                <w:rFonts w:asciiTheme="majorHAnsi" w:hAnsiTheme="majorHAnsi" w:cs="Arial"/>
+                <w:sz w:val="22"/>
+                <w:lang w:val="pl-PL"/>
+              </w:rPr>
+              <w:t>student_practice.get</w:t>
+            </w:r>
+            <w:proofErr w:type="spellEnd"/>
+            <w:r>
+              <w:rPr>
+                <w:rFonts w:asciiTheme="majorHAnsi" w:hAnsiTheme="majorHAnsi" w:cs="Arial"/>
+                <w:sz w:val="22"/>
+                <w:lang w:val="pl-PL"/>
+              </w:rPr>
+              <w:t>(selected_student.id, {}).</w:t>
+            </w:r>
+            <w:proofErr w:type="spellStart"/>
+            <w:r>
+              <w:rPr>
+                <w:rFonts w:asciiTheme="majorHAnsi" w:hAnsiTheme="majorHAnsi" w:cs="Arial"/>
+                <w:sz w:val="22"/>
+                <w:lang w:val="pl-PL"/>
+              </w:rPr>
+              <w:t>get</w:t>
+            </w:r>
+            <w:proofErr w:type="spellEnd"/>
+            <w:r>
+              <w:rPr>
+                <w:rFonts w:asciiTheme="majorHAnsi" w:hAnsiTheme="majorHAnsi" w:cs="Arial"/>
+                <w:sz w:val="22"/>
+                <w:lang w:val="pl-PL"/>
+              </w:rPr>
+              <w:t>('</w:t>
+            </w:r>
+            <w:proofErr w:type="spellStart"/>
+            <w:r>
+              <w:rPr>
+                <w:rFonts w:asciiTheme="majorHAnsi" w:hAnsiTheme="majorHAnsi" w:cs="Arial"/>
+                <w:sz w:val="22"/>
+                <w:lang w:val="pl-PL"/>
+              </w:rPr>
+              <w:t>firmowy_stanowisko</w:t>
+            </w:r>
+            <w:proofErr w:type="spellEnd"/>
+            <w:r>
+              <w:rPr>
+                <w:rFonts w:asciiTheme="majorHAnsi" w:hAnsiTheme="majorHAnsi" w:cs="Arial"/>
+                <w:sz w:val="22"/>
+                <w:lang w:val="pl-PL"/>
+              </w:rPr>
+              <w:t>'</w:t>
             </w:r>
             <w:r>
               <w:rPr>
@@ -978,6 +1414,7 @@
               </w:rPr>
               <w:t xml:space="preserve">{{ </w:t>
             </w:r>
+            <w:proofErr w:type="spellStart"/>
             <w:r>
               <w:rPr>
                 <w:rFonts w:asciiTheme="majorHAnsi" w:eastAsia="MTBWidgets" w:hAnsiTheme="majorHAnsi" w:cs="Arial"/>
@@ -986,6 +1423,7 @@
               </w:rPr>
               <w:t>potwierdzenie_zgloszenia</w:t>
             </w:r>
+            <w:proofErr w:type="spellEnd"/>
             <w:r>
               <w:rPr>
                 <w:rFonts w:asciiTheme="majorHAnsi" w:eastAsia="MTBWidgets" w:hAnsiTheme="majorHAnsi" w:cs="Arial"/>
@@ -1008,16 +1446,70 @@
                 <w:sz w:val="22"/>
                 <w:szCs w:val="20"/>
               </w:rPr>
-              <w:t xml:space="preserve">{{ student_practice.get(selected_student.id, </w:t>
-            </w:r>
+              <w:t xml:space="preserve">{{ </w:t>
+            </w:r>
+            <w:proofErr w:type="spellStart"/>
             <w:r>
               <w:rPr>
                 <w:rFonts w:asciiTheme="majorHAnsi" w:eastAsia="MTBWidgets" w:hAnsiTheme="majorHAnsi" w:cs="Arial"/>
                 <w:sz w:val="22"/>
                 <w:szCs w:val="20"/>
               </w:rPr>
+              <w:t>student_practice.get</w:t>
+            </w:r>
+            <w:proofErr w:type="spellEnd"/>
+            <w:r>
+              <w:rPr>
+                <w:rFonts w:asciiTheme="majorHAnsi" w:eastAsia="MTBWidgets" w:hAnsiTheme="majorHAnsi" w:cs="Arial"/>
+                <w:sz w:val="22"/>
+                <w:szCs w:val="20"/>
+              </w:rPr>
+              <w:t xml:space="preserve">(selected_student.id, </w:t>
+            </w:r>
+            <w:r>
+              <w:rPr>
+                <w:rFonts w:asciiTheme="majorHAnsi" w:eastAsia="MTBWidgets" w:hAnsiTheme="majorHAnsi" w:cs="Arial"/>
+                <w:sz w:val="22"/>
+                <w:szCs w:val="20"/>
+              </w:rPr>
               <w:lastRenderedPageBreak/>
-              <w:t>{}).get('firmowy_opiekun'</w:t>
+              <w:t>{}).</w:t>
+            </w:r>
+            <w:proofErr w:type="spellStart"/>
+            <w:r>
+              <w:rPr>
+                <w:rFonts w:asciiTheme="majorHAnsi" w:eastAsia="MTBWidgets" w:hAnsiTheme="majorHAnsi" w:cs="Arial"/>
+                <w:sz w:val="22"/>
+                <w:szCs w:val="20"/>
+              </w:rPr>
+              <w:t>get</w:t>
+            </w:r>
+            <w:proofErr w:type="spellEnd"/>
+            <w:r>
+              <w:rPr>
+                <w:rFonts w:asciiTheme="majorHAnsi" w:eastAsia="MTBWidgets" w:hAnsiTheme="majorHAnsi" w:cs="Arial"/>
+                <w:sz w:val="22"/>
+                <w:szCs w:val="20"/>
+              </w:rPr>
+              <w:t>('</w:t>
+            </w:r>
+            <w:proofErr w:type="spellStart"/>
+            <w:r>
+              <w:rPr>
+                <w:rFonts w:asciiTheme="majorHAnsi" w:eastAsia="MTBWidgets" w:hAnsiTheme="majorHAnsi" w:cs="Arial"/>
+                <w:sz w:val="22"/>
+                <w:szCs w:val="20"/>
+              </w:rPr>
+              <w:t>firmowy_opiekun</w:t>
+            </w:r>
+            <w:proofErr w:type="spellEnd"/>
+            <w:r>
+              <w:rPr>
+                <w:rFonts w:asciiTheme="majorHAnsi" w:eastAsia="MTBWidgets" w:hAnsiTheme="majorHAnsi" w:cs="Arial"/>
+                <w:sz w:val="22"/>
+                <w:szCs w:val="20"/>
+              </w:rPr>
+              <w:t>'</w:t>
             </w:r>
             <w:r>
               <w:rPr>
@@ -1086,6 +1578,7 @@
               </w:rPr>
               <w:t xml:space="preserve">{{ </w:t>
             </w:r>
+            <w:proofErr w:type="spellStart"/>
             <w:r>
               <w:rPr>
                 <w:rFonts w:asciiTheme="majorHAnsi" w:eastAsia="MTBWidgets" w:hAnsiTheme="majorHAnsi" w:cs="Arial"/>
@@ -1094,6 +1587,7 @@
               </w:rPr>
               <w:t>potwierdzenie_szkolenia</w:t>
             </w:r>
+            <w:proofErr w:type="spellEnd"/>
             <w:r>
               <w:rPr>
                 <w:rFonts w:asciiTheme="majorHAnsi" w:eastAsia="MTBWidgets" w:hAnsiTheme="majorHAnsi" w:cs="Arial"/>
@@ -1116,7 +1610,61 @@
                 <w:sz w:val="22"/>
                 <w:szCs w:val="20"/>
               </w:rPr>
-              <w:t>{{ student_practice.get(selected_student.id, {}).get('firmowy_opiekun'</w:t>
+              <w:t xml:space="preserve">{{ </w:t>
+            </w:r>
+            <w:proofErr w:type="spellStart"/>
+            <w:r>
+              <w:rPr>
+                <w:rFonts w:asciiTheme="majorHAnsi" w:eastAsia="MTBWidgets" w:hAnsiTheme="majorHAnsi" w:cs="Arial"/>
+                <w:sz w:val="22"/>
+                <w:szCs w:val="20"/>
+              </w:rPr>
+              <w:t>student_practice.get</w:t>
+            </w:r>
+            <w:proofErr w:type="spellEnd"/>
+            <w:r>
+              <w:rPr>
+                <w:rFonts w:asciiTheme="majorHAnsi" w:eastAsia="MTBWidgets" w:hAnsiTheme="majorHAnsi" w:cs="Arial"/>
+                <w:sz w:val="22"/>
+                <w:szCs w:val="20"/>
+              </w:rPr>
+              <w:t>(selected_student.id, {}).</w:t>
+            </w:r>
+            <w:proofErr w:type="spellStart"/>
+            <w:r>
+              <w:rPr>
+                <w:rFonts w:asciiTheme="majorHAnsi" w:eastAsia="MTBWidgets" w:hAnsiTheme="majorHAnsi" w:cs="Arial"/>
+                <w:sz w:val="22"/>
+                <w:szCs w:val="20"/>
+              </w:rPr>
+              <w:t>get</w:t>
+            </w:r>
+            <w:proofErr w:type="spellEnd"/>
+            <w:r>
+              <w:rPr>
+                <w:rFonts w:asciiTheme="majorHAnsi" w:eastAsia="MTBWidgets" w:hAnsiTheme="majorHAnsi" w:cs="Arial"/>
+                <w:sz w:val="22"/>
+                <w:szCs w:val="20"/>
+              </w:rPr>
+              <w:t>('</w:t>
+            </w:r>
+            <w:proofErr w:type="spellStart"/>
+            <w:r>
+              <w:rPr>
+                <w:rFonts w:asciiTheme="majorHAnsi" w:eastAsia="MTBWidgets" w:hAnsiTheme="majorHAnsi" w:cs="Arial"/>
+                <w:sz w:val="22"/>
+                <w:szCs w:val="20"/>
+              </w:rPr>
+              <w:t>firmowy_opiekun</w:t>
+            </w:r>
+            <w:proofErr w:type="spellEnd"/>
+            <w:r>
+              <w:rPr>
+                <w:rFonts w:asciiTheme="majorHAnsi" w:eastAsia="MTBWidgets" w:hAnsiTheme="majorHAnsi" w:cs="Arial"/>
+                <w:sz w:val="22"/>
+                <w:szCs w:val="20"/>
+              </w:rPr>
+              <w:t>'</w:t>
             </w:r>
             <w:r>
               <w:rPr>
@@ -1219,7 +1767,43 @@
                 <w:sz w:val="20"/>
                 <w:szCs w:val="20"/>
               </w:rPr>
-              <w:t>{{ student.imie }} {{ student.nazwisko }}</w:t>
+              <w:t xml:space="preserve">{{ </w:t>
+            </w:r>
+            <w:proofErr w:type="spellStart"/>
+            <w:r>
+              <w:rPr>
+                <w:rFonts w:asciiTheme="majorHAnsi" w:hAnsiTheme="majorHAnsi"/>
+                <w:sz w:val="20"/>
+                <w:szCs w:val="20"/>
+              </w:rPr>
+              <w:t>student.imie</w:t>
+            </w:r>
+            <w:proofErr w:type="spellEnd"/>
+            <w:r>
+              <w:rPr>
+                <w:rFonts w:asciiTheme="majorHAnsi" w:hAnsiTheme="majorHAnsi"/>
+                <w:sz w:val="20"/>
+                <w:szCs w:val="20"/>
+              </w:rPr>
+              <w:t xml:space="preserve"> }} {{ </w:t>
+            </w:r>
+            <w:proofErr w:type="spellStart"/>
+            <w:r>
+              <w:rPr>
+                <w:rFonts w:asciiTheme="majorHAnsi" w:hAnsiTheme="majorHAnsi"/>
+                <w:sz w:val="20"/>
+                <w:szCs w:val="20"/>
+              </w:rPr>
+              <w:t>student.nazwisko</w:t>
+            </w:r>
+            <w:proofErr w:type="spellEnd"/>
+            <w:r>
+              <w:rPr>
+                <w:rFonts w:asciiTheme="majorHAnsi" w:hAnsiTheme="majorHAnsi"/>
+                <w:sz w:val="20"/>
+                <w:szCs w:val="20"/>
+              </w:rPr>
+              <w:t xml:space="preserve"> }}</w:t>
             </w:r>
             <w:r>
               <w:rPr>
@@ -1280,7 +1864,61 @@
                 <w:sz w:val="20"/>
                 <w:szCs w:val="22"/>
               </w:rPr>
-              <w:t>{{ student_practice.get(selected_student.id, {}).get('nazwa_zakladu_pracy'</w:t>
+              <w:t xml:space="preserve">{{ </w:t>
+            </w:r>
+            <w:proofErr w:type="spellStart"/>
+            <w:r>
+              <w:rPr>
+                <w:rFonts w:asciiTheme="majorHAnsi" w:hAnsiTheme="majorHAnsi" w:cs="Arial"/>
+                <w:sz w:val="20"/>
+                <w:szCs w:val="22"/>
+              </w:rPr>
+              <w:t>student_practice.get</w:t>
+            </w:r>
+            <w:proofErr w:type="spellEnd"/>
+            <w:r>
+              <w:rPr>
+                <w:rFonts w:asciiTheme="majorHAnsi" w:hAnsiTheme="majorHAnsi" w:cs="Arial"/>
+                <w:sz w:val="20"/>
+                <w:szCs w:val="22"/>
+              </w:rPr>
+              <w:t>(selected_student.id, {}).</w:t>
+            </w:r>
+            <w:proofErr w:type="spellStart"/>
+            <w:r>
+              <w:rPr>
+                <w:rFonts w:asciiTheme="majorHAnsi" w:hAnsiTheme="majorHAnsi" w:cs="Arial"/>
+                <w:sz w:val="20"/>
+                <w:szCs w:val="22"/>
+              </w:rPr>
+              <w:t>get</w:t>
+            </w:r>
+            <w:proofErr w:type="spellEnd"/>
+            <w:r>
+              <w:rPr>
+                <w:rFonts w:asciiTheme="majorHAnsi" w:hAnsiTheme="majorHAnsi" w:cs="Arial"/>
+                <w:sz w:val="20"/>
+                <w:szCs w:val="22"/>
+              </w:rPr>
+              <w:t>('</w:t>
+            </w:r>
+            <w:proofErr w:type="spellStart"/>
+            <w:r>
+              <w:rPr>
+                <w:rFonts w:asciiTheme="majorHAnsi" w:hAnsiTheme="majorHAnsi" w:cs="Arial"/>
+                <w:sz w:val="20"/>
+                <w:szCs w:val="22"/>
+              </w:rPr>
+              <w:t>nazwa_zakladu_pracy</w:t>
+            </w:r>
+            <w:proofErr w:type="spellEnd"/>
+            <w:r>
+              <w:rPr>
+                <w:rFonts w:asciiTheme="majorHAnsi" w:hAnsiTheme="majorHAnsi" w:cs="Arial"/>
+                <w:sz w:val="20"/>
+                <w:szCs w:val="22"/>
+              </w:rPr>
+              <w:t>'</w:t>
             </w:r>
             <w:r>
               <w:rPr>
@@ -1334,7 +1972,73 @@
                 <w:sz w:val="20"/>
                 <w:szCs w:val="22"/>
               </w:rPr>
-              <w:t>{{ student_practice.get(selected_student.id, {}).get('termin_od') }}</w:t>
+              <w:t xml:space="preserve">{{ </w:t>
+            </w:r>
+            <w:proofErr w:type="spellStart"/>
+            <w:r>
+              <w:rPr>
+                <w:rFonts w:asciiTheme="majorHAnsi" w:hAnsiTheme="majorHAnsi"/>
+                <w:bCs/>
+                <w:color w:val="000000"/>
+                <w:sz w:val="20"/>
+                <w:szCs w:val="22"/>
+              </w:rPr>
+              <w:t>student_practice.get</w:t>
+            </w:r>
+            <w:proofErr w:type="spellEnd"/>
+            <w:r>
+              <w:rPr>
+                <w:rFonts w:asciiTheme="majorHAnsi" w:hAnsiTheme="majorHAnsi"/>
+                <w:bCs/>
+                <w:color w:val="000000"/>
+                <w:sz w:val="20"/>
+                <w:szCs w:val="22"/>
+              </w:rPr>
+              <w:t>(selected_student.id, {}).</w:t>
+            </w:r>
+            <w:proofErr w:type="spellStart"/>
+            <w:r>
+              <w:rPr>
+                <w:rFonts w:asciiTheme="majorHAnsi" w:hAnsiTheme="majorHAnsi"/>
+                <w:bCs/>
+                <w:color w:val="000000"/>
+                <w:sz w:val="20"/>
+                <w:szCs w:val="22"/>
+              </w:rPr>
+              <w:t>get</w:t>
+            </w:r>
+            <w:proofErr w:type="spellEnd"/>
+            <w:r>
+              <w:rPr>
+                <w:rFonts w:asciiTheme="majorHAnsi" w:hAnsiTheme="majorHAnsi"/>
+                <w:bCs/>
+                <w:color w:val="000000"/>
+                <w:sz w:val="20"/>
+                <w:szCs w:val="22"/>
+              </w:rPr>
+              <w:t>('</w:t>
+            </w:r>
+            <w:proofErr w:type="spellStart"/>
+            <w:r>
+              <w:rPr>
+                <w:rFonts w:asciiTheme="majorHAnsi" w:hAnsiTheme="majorHAnsi"/>
+                <w:bCs/>
+                <w:color w:val="000000"/>
+                <w:sz w:val="20"/>
+                <w:szCs w:val="22"/>
+              </w:rPr>
+              <w:t>termin_od</w:t>
+            </w:r>
+            <w:proofErr w:type="spellEnd"/>
+            <w:r>
+              <w:rPr>
+                <w:rFonts w:asciiTheme="majorHAnsi" w:hAnsiTheme="majorHAnsi"/>
+                <w:bCs/>
+                <w:color w:val="000000"/>
+                <w:sz w:val="20"/>
+                <w:szCs w:val="22"/>
+              </w:rPr>
+              <w:t>') }}</w:t>
             </w:r>
             <w:r>
               <w:rPr>
@@ -1370,6 +2074,7 @@
               </w:rPr>
               <w:t xml:space="preserve">{{ </w:t>
             </w:r>
+            <w:proofErr w:type="spellStart"/>
             <w:r>
               <w:rPr>
                 <w:rFonts w:asciiTheme="majorHAnsi" w:hAnsiTheme="majorHAnsi"/>
@@ -1378,8 +2083,9 @@
                 <w:sz w:val="20"/>
                 <w:szCs w:val="22"/>
               </w:rPr>
-              <w:t>student_practice.get(selected_student.id, {}).get('termin_</w:t>
-            </w:r>
+              <w:t>student_practice.get</w:t>
+            </w:r>
+            <w:proofErr w:type="spellEnd"/>
             <w:r>
               <w:rPr>
                 <w:rFonts w:asciiTheme="majorHAnsi" w:hAnsiTheme="majorHAnsi"/>
@@ -1388,8 +2094,9 @@
                 <w:sz w:val="20"/>
                 <w:szCs w:val="22"/>
               </w:rPr>
-              <w:t>do</w:t>
-            </w:r>
+              <w:t>(selected_student.id, {}).</w:t>
+            </w:r>
+            <w:proofErr w:type="spellStart"/>
             <w:r>
               <w:rPr>
                 <w:rFonts w:asciiTheme="majorHAnsi" w:hAnsiTheme="majorHAnsi"/>
@@ -1398,6 +2105,49 @@
                 <w:sz w:val="20"/>
                 <w:szCs w:val="22"/>
               </w:rPr>
+              <w:t>get</w:t>
+            </w:r>
+            <w:proofErr w:type="spellEnd"/>
+            <w:r>
+              <w:rPr>
+                <w:rFonts w:asciiTheme="majorHAnsi" w:hAnsiTheme="majorHAnsi"/>
+                <w:bCs/>
+                <w:color w:val="000000"/>
+                <w:sz w:val="20"/>
+                <w:szCs w:val="22"/>
+              </w:rPr>
+              <w:t>('</w:t>
+            </w:r>
+            <w:proofErr w:type="spellStart"/>
+            <w:r>
+              <w:rPr>
+                <w:rFonts w:asciiTheme="majorHAnsi" w:hAnsiTheme="majorHAnsi"/>
+                <w:bCs/>
+                <w:color w:val="000000"/>
+                <w:sz w:val="20"/>
+                <w:szCs w:val="22"/>
+              </w:rPr>
+              <w:t>termin_</w:t>
+            </w:r>
+            <w:r>
+              <w:rPr>
+                <w:rFonts w:asciiTheme="majorHAnsi" w:hAnsiTheme="majorHAnsi"/>
+                <w:bCs/>
+                <w:color w:val="000000"/>
+                <w:sz w:val="20"/>
+                <w:szCs w:val="22"/>
+              </w:rPr>
+              <w:t>do</w:t>
+            </w:r>
+            <w:proofErr w:type="spellEnd"/>
+            <w:r>
+              <w:rPr>
+                <w:rFonts w:asciiTheme="majorHAnsi" w:hAnsiTheme="majorHAnsi"/>
+                <w:bCs/>
+                <w:color w:val="000000"/>
+                <w:sz w:val="20"/>
+                <w:szCs w:val="22"/>
+              </w:rPr>
               <w:t>') }}</w:t>
             </w:r>
             <w:r>
@@ -1449,7 +2199,43 @@
                 <w:sz w:val="20"/>
                 <w:szCs w:val="22"/>
               </w:rPr>
-              <w:t>{{ dokument_data.get('uwagi_kier'</w:t>
+              <w:t xml:space="preserve">{{ </w:t>
+            </w:r>
+            <w:proofErr w:type="spellStart"/>
+            <w:r>
+              <w:rPr>
+                <w:rFonts w:asciiTheme="majorHAnsi" w:hAnsiTheme="majorHAnsi" w:cs="Arial"/>
+                <w:sz w:val="20"/>
+                <w:szCs w:val="22"/>
+              </w:rPr>
+              <w:t>dokument_data.get</w:t>
+            </w:r>
+            <w:proofErr w:type="spellEnd"/>
+            <w:r>
+              <w:rPr>
+                <w:rFonts w:asciiTheme="majorHAnsi" w:hAnsiTheme="majorHAnsi" w:cs="Arial"/>
+                <w:sz w:val="20"/>
+                <w:szCs w:val="22"/>
+              </w:rPr>
+              <w:t>('</w:t>
+            </w:r>
+            <w:proofErr w:type="spellStart"/>
+            <w:r>
+              <w:rPr>
+                <w:rFonts w:asciiTheme="majorHAnsi" w:hAnsiTheme="majorHAnsi" w:cs="Arial"/>
+                <w:sz w:val="20"/>
+                <w:szCs w:val="22"/>
+              </w:rPr>
+              <w:t>uwagi_kier</w:t>
+            </w:r>
+            <w:proofErr w:type="spellEnd"/>
+            <w:r>
+              <w:rPr>
+                <w:rFonts w:asciiTheme="majorHAnsi" w:hAnsiTheme="majorHAnsi" w:cs="Arial"/>
+                <w:sz w:val="20"/>
+                <w:szCs w:val="22"/>
+              </w:rPr>
+              <w:t>'</w:t>
             </w:r>
             <w:r>
               <w:rPr>
@@ -1491,7 +2277,25 @@
                 <w:sz w:val="20"/>
                 <w:szCs w:val="22"/>
               </w:rPr>
-              <w:t>{{ dokument_data.get('miejscowość') }}</w:t>
+              <w:t xml:space="preserve">{{ </w:t>
+            </w:r>
+            <w:proofErr w:type="spellStart"/>
+            <w:r>
+              <w:rPr>
+                <w:rFonts w:asciiTheme="majorHAnsi" w:hAnsiTheme="majorHAnsi" w:cs="Arial"/>
+                <w:sz w:val="20"/>
+                <w:szCs w:val="22"/>
+              </w:rPr>
+              <w:t>dokument_data.get</w:t>
+            </w:r>
+            <w:proofErr w:type="spellEnd"/>
+            <w:r>
+              <w:rPr>
+                <w:rFonts w:asciiTheme="majorHAnsi" w:hAnsiTheme="majorHAnsi" w:cs="Arial"/>
+                <w:sz w:val="20"/>
+                <w:szCs w:val="22"/>
+              </w:rPr>
+              <w:t>('miejscowość') }}</w:t>
             </w:r>
             <w:r>
               <w:rPr>
@@ -1507,7 +2311,43 @@
                 <w:sz w:val="20"/>
                 <w:szCs w:val="22"/>
               </w:rPr>
-              <w:t>{{ dokument_data.get('data_kier'</w:t>
+              <w:t xml:space="preserve">{{ </w:t>
+            </w:r>
+            <w:proofErr w:type="spellStart"/>
+            <w:r>
+              <w:rPr>
+                <w:rFonts w:asciiTheme="majorHAnsi" w:hAnsiTheme="majorHAnsi" w:cs="Arial"/>
+                <w:sz w:val="20"/>
+                <w:szCs w:val="22"/>
+              </w:rPr>
+              <w:t>dokument_data.get</w:t>
+            </w:r>
+            <w:proofErr w:type="spellEnd"/>
+            <w:r>
+              <w:rPr>
+                <w:rFonts w:asciiTheme="majorHAnsi" w:hAnsiTheme="majorHAnsi" w:cs="Arial"/>
+                <w:sz w:val="20"/>
+                <w:szCs w:val="22"/>
+              </w:rPr>
+              <w:t>('</w:t>
+            </w:r>
+            <w:proofErr w:type="spellStart"/>
+            <w:r>
+              <w:rPr>
+                <w:rFonts w:asciiTheme="majorHAnsi" w:hAnsiTheme="majorHAnsi" w:cs="Arial"/>
+                <w:sz w:val="20"/>
+                <w:szCs w:val="22"/>
+              </w:rPr>
+              <w:t>data_kier</w:t>
+            </w:r>
+            <w:proofErr w:type="spellEnd"/>
+            <w:r>
+              <w:rPr>
+                <w:rFonts w:asciiTheme="majorHAnsi" w:hAnsiTheme="majorHAnsi" w:cs="Arial"/>
+                <w:sz w:val="20"/>
+                <w:szCs w:val="22"/>
+              </w:rPr>
+              <w:t>'</w:t>
             </w:r>
             <w:r>
               <w:rPr>
@@ -1550,7 +2390,55 @@
                 <w:rFonts w:asciiTheme="majorHAnsi" w:hAnsiTheme="majorHAnsi" w:cs="Arial"/>
                 <w:sz w:val="22"/>
               </w:rPr>
-              <w:t>{{ student_practice.get(selected_student.id, {}).get('osoba_upowazniona'</w:t>
+              <w:t xml:space="preserve">{{ </w:t>
+            </w:r>
+            <w:proofErr w:type="spellStart"/>
+            <w:r>
+              <w:rPr>
+                <w:rFonts w:asciiTheme="majorHAnsi" w:hAnsiTheme="majorHAnsi" w:cs="Arial"/>
+                <w:sz w:val="22"/>
+              </w:rPr>
+              <w:t>student_practice.get</w:t>
+            </w:r>
+            <w:proofErr w:type="spellEnd"/>
+            <w:r>
+              <w:rPr>
+                <w:rFonts w:asciiTheme="majorHAnsi" w:hAnsiTheme="majorHAnsi" w:cs="Arial"/>
+                <w:sz w:val="22"/>
+              </w:rPr>
+              <w:t>(selected_student.id, {}).</w:t>
+            </w:r>
+            <w:proofErr w:type="spellStart"/>
+            <w:r>
+              <w:rPr>
+                <w:rFonts w:asciiTheme="majorHAnsi" w:hAnsiTheme="majorHAnsi" w:cs="Arial"/>
+                <w:sz w:val="22"/>
+              </w:rPr>
+              <w:t>get</w:t>
+            </w:r>
+            <w:proofErr w:type="spellEnd"/>
+            <w:r>
+              <w:rPr>
+                <w:rFonts w:asciiTheme="majorHAnsi" w:hAnsiTheme="majorHAnsi" w:cs="Arial"/>
+                <w:sz w:val="22"/>
+              </w:rPr>
+              <w:t>('</w:t>
+            </w:r>
+            <w:proofErr w:type="spellStart"/>
+            <w:r>
+              <w:rPr>
+                <w:rFonts w:asciiTheme="majorHAnsi" w:hAnsiTheme="majorHAnsi" w:cs="Arial"/>
+                <w:sz w:val="22"/>
+              </w:rPr>
+              <w:t>osoba_upowazniona</w:t>
+            </w:r>
+            <w:proofErr w:type="spellEnd"/>
+            <w:r>
+              <w:rPr>
+                <w:rFonts w:asciiTheme="majorHAnsi" w:hAnsiTheme="majorHAnsi" w:cs="Arial"/>
+                <w:sz w:val="22"/>
+              </w:rPr>
+              <w:t>'</w:t>
             </w:r>
             <w:r>
               <w:rPr>
@@ -1706,7 +2594,43 @@
                 <w:sz w:val="20"/>
                 <w:szCs w:val="22"/>
               </w:rPr>
-              <w:t>{{ dokument_data.get('ocena_przebiegu_of'</w:t>
+              <w:t xml:space="preserve">{{ </w:t>
+            </w:r>
+            <w:proofErr w:type="spellStart"/>
+            <w:r>
+              <w:rPr>
+                <w:rFonts w:asciiTheme="majorHAnsi" w:hAnsiTheme="majorHAnsi" w:cs="Arial"/>
+                <w:sz w:val="20"/>
+                <w:szCs w:val="22"/>
+              </w:rPr>
+              <w:t>dokument_data.get</w:t>
+            </w:r>
+            <w:proofErr w:type="spellEnd"/>
+            <w:r>
+              <w:rPr>
+                <w:rFonts w:asciiTheme="majorHAnsi" w:hAnsiTheme="majorHAnsi" w:cs="Arial"/>
+                <w:sz w:val="20"/>
+                <w:szCs w:val="22"/>
+              </w:rPr>
+              <w:t>('</w:t>
+            </w:r>
+            <w:proofErr w:type="spellStart"/>
+            <w:r>
+              <w:rPr>
+                <w:rFonts w:asciiTheme="majorHAnsi" w:hAnsiTheme="majorHAnsi" w:cs="Arial"/>
+                <w:sz w:val="20"/>
+                <w:szCs w:val="22"/>
+              </w:rPr>
+              <w:t>ocena_przebiegu_of</w:t>
+            </w:r>
+            <w:proofErr w:type="spellEnd"/>
+            <w:r>
+              <w:rPr>
+                <w:rFonts w:asciiTheme="majorHAnsi" w:hAnsiTheme="majorHAnsi" w:cs="Arial"/>
+                <w:sz w:val="20"/>
+                <w:szCs w:val="22"/>
+              </w:rPr>
+              <w:t>'</w:t>
             </w:r>
             <w:r>
               <w:rPr>
@@ -1748,7 +2672,43 @@
                 <w:sz w:val="20"/>
                 <w:szCs w:val="22"/>
               </w:rPr>
-              <w:t>{{ dokument_data.get('ocena_opisowa_of'</w:t>
+              <w:t xml:space="preserve">{{ </w:t>
+            </w:r>
+            <w:proofErr w:type="spellStart"/>
+            <w:r>
+              <w:rPr>
+                <w:rFonts w:asciiTheme="majorHAnsi" w:hAnsiTheme="majorHAnsi" w:cs="Arial"/>
+                <w:sz w:val="20"/>
+                <w:szCs w:val="22"/>
+              </w:rPr>
+              <w:t>dokument_data.get</w:t>
+            </w:r>
+            <w:proofErr w:type="spellEnd"/>
+            <w:r>
+              <w:rPr>
+                <w:rFonts w:asciiTheme="majorHAnsi" w:hAnsiTheme="majorHAnsi" w:cs="Arial"/>
+                <w:sz w:val="20"/>
+                <w:szCs w:val="22"/>
+              </w:rPr>
+              <w:t>('</w:t>
+            </w:r>
+            <w:proofErr w:type="spellStart"/>
+            <w:r>
+              <w:rPr>
+                <w:rFonts w:asciiTheme="majorHAnsi" w:hAnsiTheme="majorHAnsi" w:cs="Arial"/>
+                <w:sz w:val="20"/>
+                <w:szCs w:val="22"/>
+              </w:rPr>
+              <w:t>ocena_opisowa_of</w:t>
+            </w:r>
+            <w:proofErr w:type="spellEnd"/>
+            <w:r>
+              <w:rPr>
+                <w:rFonts w:asciiTheme="majorHAnsi" w:hAnsiTheme="majorHAnsi" w:cs="Arial"/>
+                <w:sz w:val="20"/>
+                <w:szCs w:val="22"/>
+              </w:rPr>
+              <w:t>'</w:t>
             </w:r>
             <w:r>
               <w:rPr>
@@ -1804,7 +2764,39 @@
                 <w:rFonts w:asciiTheme="majorHAnsi" w:hAnsiTheme="majorHAnsi" w:cs="Arial"/>
                 <w:sz w:val="22"/>
               </w:rPr>
-              <w:t>{{ dokument_data.get('data_przebiegu_of'</w:t>
+              <w:t xml:space="preserve">{{ </w:t>
+            </w:r>
+            <w:proofErr w:type="spellStart"/>
+            <w:r>
+              <w:rPr>
+                <w:rFonts w:asciiTheme="majorHAnsi" w:hAnsiTheme="majorHAnsi" w:cs="Arial"/>
+                <w:sz w:val="22"/>
+              </w:rPr>
+              <w:t>dokument_data.get</w:t>
+            </w:r>
+            <w:proofErr w:type="spellEnd"/>
+            <w:r>
+              <w:rPr>
+                <w:rFonts w:asciiTheme="majorHAnsi" w:hAnsiTheme="majorHAnsi" w:cs="Arial"/>
+                <w:sz w:val="22"/>
+              </w:rPr>
+              <w:t>('</w:t>
+            </w:r>
+            <w:proofErr w:type="spellStart"/>
+            <w:r>
+              <w:rPr>
+                <w:rFonts w:asciiTheme="majorHAnsi" w:hAnsiTheme="majorHAnsi" w:cs="Arial"/>
+                <w:sz w:val="22"/>
+              </w:rPr>
+              <w:t>data_przebiegu_of</w:t>
+            </w:r>
+            <w:proofErr w:type="spellEnd"/>
+            <w:r>
+              <w:rPr>
+                <w:rFonts w:asciiTheme="majorHAnsi" w:hAnsiTheme="majorHAnsi" w:cs="Arial"/>
+                <w:sz w:val="22"/>
+              </w:rPr>
+              <w:t>'</w:t>
             </w:r>
             <w:r>
               <w:rPr>
@@ -1829,13 +2821,59 @@
               </w:rPr>
               <w:t xml:space="preserve"> </w:t>
             </w:r>
+            <w:proofErr w:type="spellStart"/>
             <w:r>
               <w:rPr>
                 <w:rFonts w:asciiTheme="majorHAnsi" w:eastAsia="MTBWidgets" w:hAnsiTheme="majorHAnsi" w:cs="Arial"/>
                 <w:sz w:val="22"/>
                 <w:szCs w:val="20"/>
               </w:rPr>
-              <w:t>student_practice.get(selected_student.id, {}).get('firmowy_opiekun'</w:t>
+              <w:t>student_practice.get</w:t>
+            </w:r>
+            <w:proofErr w:type="spellEnd"/>
+            <w:r>
+              <w:rPr>
+                <w:rFonts w:asciiTheme="majorHAnsi" w:eastAsia="MTBWidgets" w:hAnsiTheme="majorHAnsi" w:cs="Arial"/>
+                <w:sz w:val="22"/>
+                <w:szCs w:val="20"/>
+              </w:rPr>
+              <w:t>(selected_student.id, {}).</w:t>
+            </w:r>
+            <w:proofErr w:type="spellStart"/>
+            <w:r>
+              <w:rPr>
+                <w:rFonts w:asciiTheme="majorHAnsi" w:eastAsia="MTBWidgets" w:hAnsiTheme="majorHAnsi" w:cs="Arial"/>
+                <w:sz w:val="22"/>
+                <w:szCs w:val="20"/>
+              </w:rPr>
+              <w:t>get</w:t>
+            </w:r>
+            <w:proofErr w:type="spellEnd"/>
+            <w:r>
+              <w:rPr>
+                <w:rFonts w:asciiTheme="majorHAnsi" w:eastAsia="MTBWidgets" w:hAnsiTheme="majorHAnsi" w:cs="Arial"/>
+                <w:sz w:val="22"/>
+                <w:szCs w:val="20"/>
+              </w:rPr>
+              <w:t>('</w:t>
+            </w:r>
+            <w:proofErr w:type="spellStart"/>
+            <w:r>
+              <w:rPr>
+                <w:rFonts w:asciiTheme="majorHAnsi" w:eastAsia="MTBWidgets" w:hAnsiTheme="majorHAnsi" w:cs="Arial"/>
+                <w:sz w:val="22"/>
+                <w:szCs w:val="20"/>
+              </w:rPr>
+              <w:t>firmowy_opiekun</w:t>
+            </w:r>
+            <w:proofErr w:type="spellEnd"/>
+            <w:r>
+              <w:rPr>
+                <w:rFonts w:asciiTheme="majorHAnsi" w:eastAsia="MTBWidgets" w:hAnsiTheme="majorHAnsi" w:cs="Arial"/>
+                <w:sz w:val="22"/>
+                <w:szCs w:val="20"/>
+              </w:rPr>
+              <w:t>'</w:t>
             </w:r>
             <w:r>
               <w:rPr>
@@ -1937,7 +2975,43 @@
                 <w:sz w:val="20"/>
                 <w:szCs w:val="22"/>
               </w:rPr>
-              <w:t>{{ dokument_data.get('ocena_przebiegu_ou'</w:t>
+              <w:t xml:space="preserve">{{ </w:t>
+            </w:r>
+            <w:proofErr w:type="spellStart"/>
+            <w:r>
+              <w:rPr>
+                <w:rFonts w:asciiTheme="majorHAnsi" w:hAnsiTheme="majorHAnsi" w:cs="Arial"/>
+                <w:sz w:val="20"/>
+                <w:szCs w:val="22"/>
+              </w:rPr>
+              <w:t>dokument_data.get</w:t>
+            </w:r>
+            <w:proofErr w:type="spellEnd"/>
+            <w:r>
+              <w:rPr>
+                <w:rFonts w:asciiTheme="majorHAnsi" w:hAnsiTheme="majorHAnsi" w:cs="Arial"/>
+                <w:sz w:val="20"/>
+                <w:szCs w:val="22"/>
+              </w:rPr>
+              <w:t>('</w:t>
+            </w:r>
+            <w:proofErr w:type="spellStart"/>
+            <w:r>
+              <w:rPr>
+                <w:rFonts w:asciiTheme="majorHAnsi" w:hAnsiTheme="majorHAnsi" w:cs="Arial"/>
+                <w:sz w:val="20"/>
+                <w:szCs w:val="22"/>
+              </w:rPr>
+              <w:t>ocena_przebiegu_ou</w:t>
+            </w:r>
+            <w:proofErr w:type="spellEnd"/>
+            <w:r>
+              <w:rPr>
+                <w:rFonts w:asciiTheme="majorHAnsi" w:hAnsiTheme="majorHAnsi" w:cs="Arial"/>
+                <w:sz w:val="20"/>
+                <w:szCs w:val="22"/>
+              </w:rPr>
+              <w:t>'</w:t>
             </w:r>
             <w:r>
               <w:rPr>
@@ -1999,7 +3073,43 @@
                 <w:sz w:val="20"/>
                 <w:szCs w:val="22"/>
               </w:rPr>
-              <w:t>{{ dokument_data.get('ocena_opisowa_ou'</w:t>
+              <w:t xml:space="preserve">{{ </w:t>
+            </w:r>
+            <w:proofErr w:type="spellStart"/>
+            <w:r>
+              <w:rPr>
+                <w:rFonts w:asciiTheme="majorHAnsi" w:hAnsiTheme="majorHAnsi" w:cs="Arial"/>
+                <w:sz w:val="20"/>
+                <w:szCs w:val="22"/>
+              </w:rPr>
+              <w:t>dokument_data.get</w:t>
+            </w:r>
+            <w:proofErr w:type="spellEnd"/>
+            <w:r>
+              <w:rPr>
+                <w:rFonts w:asciiTheme="majorHAnsi" w:hAnsiTheme="majorHAnsi" w:cs="Arial"/>
+                <w:sz w:val="20"/>
+                <w:szCs w:val="22"/>
+              </w:rPr>
+              <w:t>('</w:t>
+            </w:r>
+            <w:proofErr w:type="spellStart"/>
+            <w:r>
+              <w:rPr>
+                <w:rFonts w:asciiTheme="majorHAnsi" w:hAnsiTheme="majorHAnsi" w:cs="Arial"/>
+                <w:sz w:val="20"/>
+                <w:szCs w:val="22"/>
+              </w:rPr>
+              <w:t>ocena_opisowa_ou</w:t>
+            </w:r>
+            <w:proofErr w:type="spellEnd"/>
+            <w:r>
+              <w:rPr>
+                <w:rFonts w:asciiTheme="majorHAnsi" w:hAnsiTheme="majorHAnsi" w:cs="Arial"/>
+                <w:sz w:val="20"/>
+                <w:szCs w:val="22"/>
+              </w:rPr>
+              <w:t>'</w:t>
             </w:r>
             <w:r>
               <w:rPr>
@@ -2053,7 +3163,31 @@
                 <w:rFonts w:asciiTheme="majorHAnsi" w:hAnsiTheme="majorHAnsi" w:cs="Arial"/>
                 <w:sz w:val="22"/>
               </w:rPr>
-              <w:t>{{ dokument_data.get('data_przebiegu_o</w:t>
+              <w:t xml:space="preserve">{{ </w:t>
+            </w:r>
+            <w:proofErr w:type="spellStart"/>
+            <w:r>
+              <w:rPr>
+                <w:rFonts w:asciiTheme="majorHAnsi" w:hAnsiTheme="majorHAnsi" w:cs="Arial"/>
+                <w:sz w:val="22"/>
+              </w:rPr>
+              <w:t>dokument_data.get</w:t>
+            </w:r>
+            <w:proofErr w:type="spellEnd"/>
+            <w:r>
+              <w:rPr>
+                <w:rFonts w:asciiTheme="majorHAnsi" w:hAnsiTheme="majorHAnsi" w:cs="Arial"/>
+                <w:sz w:val="22"/>
+              </w:rPr>
+              <w:t>('</w:t>
+            </w:r>
+            <w:proofErr w:type="spellStart"/>
+            <w:r>
+              <w:rPr>
+                <w:rFonts w:asciiTheme="majorHAnsi" w:hAnsiTheme="majorHAnsi" w:cs="Arial"/>
+                <w:sz w:val="22"/>
+              </w:rPr>
+              <w:t>data_przebiegu_o</w:t>
             </w:r>
             <w:r>
               <w:rPr>
@@ -2062,6 +3196,7 @@
               </w:rPr>
               <w:t>u</w:t>
             </w:r>
+            <w:proofErr w:type="spellEnd"/>
             <w:r>
               <w:rPr>
                 <w:rFonts w:asciiTheme="majorHAnsi" w:hAnsiTheme="majorHAnsi" w:cs="Arial"/>
@@ -2081,7 +3216,55 @@
                 <w:rFonts w:asciiTheme="majorHAnsi" w:hAnsiTheme="majorHAnsi" w:cs="Arial"/>
                 <w:sz w:val="22"/>
               </w:rPr>
-              <w:t>{{ student_practice.get(selected_student.id, {}).get('uczelniany_opiekun'</w:t>
+              <w:t xml:space="preserve">{{ </w:t>
+            </w:r>
+            <w:proofErr w:type="spellStart"/>
+            <w:r>
+              <w:rPr>
+                <w:rFonts w:asciiTheme="majorHAnsi" w:hAnsiTheme="majorHAnsi" w:cs="Arial"/>
+                <w:sz w:val="22"/>
+              </w:rPr>
+              <w:t>student_practice.get</w:t>
+            </w:r>
+            <w:proofErr w:type="spellEnd"/>
+            <w:r>
+              <w:rPr>
+                <w:rFonts w:asciiTheme="majorHAnsi" w:hAnsiTheme="majorHAnsi" w:cs="Arial"/>
+                <w:sz w:val="22"/>
+              </w:rPr>
+              <w:t>(selected_student.id, {}).</w:t>
+            </w:r>
+            <w:proofErr w:type="spellStart"/>
+            <w:r>
+              <w:rPr>
+                <w:rFonts w:asciiTheme="majorHAnsi" w:hAnsiTheme="majorHAnsi" w:cs="Arial"/>
+                <w:sz w:val="22"/>
+              </w:rPr>
+              <w:t>get</w:t>
+            </w:r>
+            <w:proofErr w:type="spellEnd"/>
+            <w:r>
+              <w:rPr>
+                <w:rFonts w:asciiTheme="majorHAnsi" w:hAnsiTheme="majorHAnsi" w:cs="Arial"/>
+                <w:sz w:val="22"/>
+              </w:rPr>
+              <w:t>('</w:t>
+            </w:r>
+            <w:proofErr w:type="spellStart"/>
+            <w:r>
+              <w:rPr>
+                <w:rFonts w:asciiTheme="majorHAnsi" w:hAnsiTheme="majorHAnsi" w:cs="Arial"/>
+                <w:sz w:val="22"/>
+              </w:rPr>
+              <w:t>uczelniany_opiekun</w:t>
+            </w:r>
+            <w:proofErr w:type="spellEnd"/>
+            <w:r>
+              <w:rPr>
+                <w:rFonts w:asciiTheme="majorHAnsi" w:hAnsiTheme="majorHAnsi" w:cs="Arial"/>
+                <w:sz w:val="22"/>
+              </w:rPr>
+              <w:t>'</w:t>
             </w:r>
             <w:r>
               <w:rPr>
@@ -2183,8 +3366,9 @@
                 <w:bCs/>
                 <w:sz w:val="22"/>
               </w:rPr>
-              <w:t>{{ dokument_data.get('ocena_spraw</w:t>
-            </w:r>
+              <w:t xml:space="preserve">{{ </w:t>
+            </w:r>
+            <w:proofErr w:type="spellStart"/>
             <w:r>
               <w:rPr>
                 <w:rFonts w:asciiTheme="majorHAnsi" w:hAnsiTheme="majorHAnsi"/>
@@ -2192,8 +3376,47 @@
                 <w:bCs/>
                 <w:sz w:val="22"/>
               </w:rPr>
+              <w:t>dokument_data.get</w:t>
+            </w:r>
+            <w:proofErr w:type="spellEnd"/>
+            <w:r>
+              <w:rPr>
+                <w:rFonts w:asciiTheme="majorHAnsi" w:hAnsiTheme="majorHAnsi"/>
+                <w:b/>
+                <w:bCs/>
+                <w:sz w:val="22"/>
+              </w:rPr>
+              <w:t>('</w:t>
+            </w:r>
+            <w:proofErr w:type="spellStart"/>
+            <w:r>
+              <w:rPr>
+                <w:rFonts w:asciiTheme="majorHAnsi" w:hAnsiTheme="majorHAnsi"/>
+                <w:b/>
+                <w:bCs/>
+                <w:sz w:val="22"/>
+              </w:rPr>
+              <w:t>ocena_spraw</w:t>
+            </w:r>
+            <w:r>
+              <w:rPr>
+                <w:rFonts w:asciiTheme="majorHAnsi" w:hAnsiTheme="majorHAnsi"/>
+                <w:b/>
+                <w:bCs/>
+                <w:sz w:val="22"/>
+              </w:rPr>
               <w:lastRenderedPageBreak/>
-              <w:t>ozdania') }}</w:t>
+              <w:t>ozdania</w:t>
+            </w:r>
+            <w:proofErr w:type="spellEnd"/>
+            <w:r>
+              <w:rPr>
+                <w:rFonts w:asciiTheme="majorHAnsi" w:hAnsiTheme="majorHAnsi"/>
+                <w:b/>
+                <w:bCs/>
+                <w:sz w:val="22"/>
+              </w:rPr>
+              <w:t>') }}</w:t>
             </w:r>
           </w:p>
           <w:p>
@@ -2247,7 +3470,39 @@
                 <w:rFonts w:asciiTheme="majorHAnsi" w:hAnsiTheme="majorHAnsi"/>
                 <w:sz w:val="22"/>
               </w:rPr>
-              <w:t>{{ dokument_data.get('data_sprawozdania'</w:t>
+              <w:t xml:space="preserve">{{ </w:t>
+            </w:r>
+            <w:proofErr w:type="spellStart"/>
+            <w:r>
+              <w:rPr>
+                <w:rFonts w:asciiTheme="majorHAnsi" w:hAnsiTheme="majorHAnsi"/>
+                <w:sz w:val="22"/>
+              </w:rPr>
+              <w:t>dokument_data.get</w:t>
+            </w:r>
+            <w:proofErr w:type="spellEnd"/>
+            <w:r>
+              <w:rPr>
+                <w:rFonts w:asciiTheme="majorHAnsi" w:hAnsiTheme="majorHAnsi"/>
+                <w:sz w:val="22"/>
+              </w:rPr>
+              <w:t>('</w:t>
+            </w:r>
+            <w:proofErr w:type="spellStart"/>
+            <w:r>
+              <w:rPr>
+                <w:rFonts w:asciiTheme="majorHAnsi" w:hAnsiTheme="majorHAnsi"/>
+                <w:sz w:val="22"/>
+              </w:rPr>
+              <w:t>data_sprawozdania</w:t>
+            </w:r>
+            <w:proofErr w:type="spellEnd"/>
+            <w:r>
+              <w:rPr>
+                <w:rFonts w:asciiTheme="majorHAnsi" w:hAnsiTheme="majorHAnsi"/>
+                <w:sz w:val="22"/>
+              </w:rPr>
+              <w:t>'</w:t>
             </w:r>
             <w:r>
               <w:rPr>
@@ -2261,7 +3516,55 @@
                 <w:rFonts w:asciiTheme="majorHAnsi" w:hAnsiTheme="majorHAnsi"/>
                 <w:sz w:val="22"/>
               </w:rPr>
-              <w:t>{{ student_practice.get(selected_student.id, {}).get('uczelniany_opiekun'</w:t>
+              <w:t xml:space="preserve">{{ </w:t>
+            </w:r>
+            <w:proofErr w:type="spellStart"/>
+            <w:r>
+              <w:rPr>
+                <w:rFonts w:asciiTheme="majorHAnsi" w:hAnsiTheme="majorHAnsi"/>
+                <w:sz w:val="22"/>
+              </w:rPr>
+              <w:t>student_practice.get</w:t>
+            </w:r>
+            <w:proofErr w:type="spellEnd"/>
+            <w:r>
+              <w:rPr>
+                <w:rFonts w:asciiTheme="majorHAnsi" w:hAnsiTheme="majorHAnsi"/>
+                <w:sz w:val="22"/>
+              </w:rPr>
+              <w:t>(selected_student.id, {}).</w:t>
+            </w:r>
+            <w:proofErr w:type="spellStart"/>
+            <w:r>
+              <w:rPr>
+                <w:rFonts w:asciiTheme="majorHAnsi" w:hAnsiTheme="majorHAnsi"/>
+                <w:sz w:val="22"/>
+              </w:rPr>
+              <w:t>get</w:t>
+            </w:r>
+            <w:proofErr w:type="spellEnd"/>
+            <w:r>
+              <w:rPr>
+                <w:rFonts w:asciiTheme="majorHAnsi" w:hAnsiTheme="majorHAnsi"/>
+                <w:sz w:val="22"/>
+              </w:rPr>
+              <w:t>('</w:t>
+            </w:r>
+            <w:proofErr w:type="spellStart"/>
+            <w:r>
+              <w:rPr>
+                <w:rFonts w:asciiTheme="majorHAnsi" w:hAnsiTheme="majorHAnsi"/>
+                <w:sz w:val="22"/>
+              </w:rPr>
+              <w:t>uczelniany_opiekun</w:t>
+            </w:r>
+            <w:proofErr w:type="spellEnd"/>
+            <w:r>
+              <w:rPr>
+                <w:rFonts w:asciiTheme="majorHAnsi" w:hAnsiTheme="majorHAnsi"/>
+                <w:sz w:val="22"/>
+              </w:rPr>
+              <w:t>'</w:t>
             </w:r>
             <w:r>
               <w:rPr>
@@ -2301,21 +3604,6 @@
           <w:sz w:val="18"/>
         </w:rPr>
       </w:pPr>
-      <w:r>
-        <w:rPr>
-          <w:rFonts w:asciiTheme="majorHAnsi" w:hAnsiTheme="majorHAnsi"/>
-          <w:sz w:val="22"/>
-        </w:rPr>
-        <w:lastRenderedPageBreak/>
-        <w:t xml:space="preserve">*)  </w:t>
-      </w:r>
-      <w:r>
-        <w:rPr>
-          <w:rFonts w:asciiTheme="majorHAnsi" w:hAnsiTheme="majorHAnsi"/>
-          <w:sz w:val="18"/>
-        </w:rPr>
-        <w:t>niewłaściwe skreślić</w:t>
-      </w:r>
     </w:p>
     <w:sectPr>
       <w:headerReference w:type="even" r:id="rId7"/>
@@ -3786,6 +5074,7 @@
   <w:style w:type="character" w:default="1" w:styleId="Domylnaczcionkaakapitu">
     <w:name w:val="Default Paragraph Font"/>
     <w:uiPriority w:val="1"/>
+    <w:semiHidden/>
     <w:unhideWhenUsed/>
   </w:style>
   <w:style w:type="table" w:default="1" w:styleId="Standardowy">

</xml_diff>